<commit_message>
Corrige Test Tema 1 · P9: la respuesta correcta es A (perilinfa), no B
Validado contra el resultado oficial del campus: la opción B
(inversamente proporcional a la longitud de las fibras pilosas) es una
formulación imprecisa. La frecuencia se refleja en las vibraciones del
fluido coclear (perilinfa) → opción A.

- data: tp1-09 correct [1] -> [0] + explicación actualizada
- referencia tests-preparatorios.md actualizada
- Word Tests-resueltos regenerado
- SW cache -> v18

Co-Authored-By: Claude Opus 4.8 <noreply@anthropic.com>
</commit_message>
<xml_diff>
--- a/referencias/vision-artificial/Tests-VisionArtificial-resueltos.docx
+++ b/referencias/vision-artificial/Tests-VisionArtificial-resueltos.docx
@@ -1364,44 +1364,44 @@
       </w:pPr>
       <w:r>
         <w:rPr>
-          <w:b w:val="false"/>
-          <w:bCs w:val="false"/>
+          <w:b/>
+          <w:bCs/>
+          <w:color w:val="2F9E44"/>
         </w:rPr>
         <w:t xml:space="preserve">A) </w:t>
       </w:r>
       <w:r>
+        <w:rPr>
+          <w:b/>
+          <w:bCs/>
+          <w:color w:val="2F9E44"/>
+        </w:rPr>
         <w:t xml:space="preserve">Se refleja en las vibraciones del fluido interno de la cóclea (perilinfa)</w:t>
       </w:r>
-    </w:p>
-    <w:p>
-      <w:pPr>
-        <w:spacing w:after="20"/>
-        <w:ind w:left="360"/>
-      </w:pPr>
-      <w:r>
-        <w:rPr>
-          <w:b/>
-          <w:bCs/>
-          <w:color w:val="2F9E44"/>
+      <w:r>
+        <w:rPr>
+          <w:b/>
+          <w:bCs/>
+          <w:color w:val="2F9E44"/>
+        </w:rPr>
+        <w:t xml:space="preserve">  ✓</w:t>
+      </w:r>
+    </w:p>
+    <w:p>
+      <w:pPr>
+        <w:spacing w:after="20"/>
+        <w:ind w:left="360"/>
+      </w:pPr>
+      <w:r>
+        <w:rPr>
+          <w:b w:val="false"/>
+          <w:bCs w:val="false"/>
         </w:rPr>
         <w:t xml:space="preserve">B) </w:t>
       </w:r>
       <w:r>
-        <w:rPr>
-          <w:b/>
-          <w:bCs/>
-          <w:color w:val="2F9E44"/>
-        </w:rPr>
         <w:t xml:space="preserve">Es inversamente proporcional a la longitud de las fibras pilosas que capturan el movimiento de la perilinfa</w:t>
       </w:r>
-      <w:r>
-        <w:rPr>
-          <w:b/>
-          <w:bCs/>
-          <w:color w:val="2F9E44"/>
-        </w:rPr>
-        <w:t xml:space="preserve">  ✓</w:t>
-      </w:r>
     </w:p>
     <w:p>
       <w:pPr>
@@ -1454,7 +1454,7 @@
           <w:bCs/>
           <w:color w:val="2F9E44"/>
         </w:rPr>
-        <w:t xml:space="preserve">B</w:t>
+        <w:t xml:space="preserve">A</w:t>
       </w:r>
     </w:p>
     <w:p>
@@ -1481,7 +1481,7 @@
           <w:iCs/>
           <w:color w:val="5C6570"/>
         </w:rPr>
-        <w:t xml:space="preserve">Codificación tonotópica: las fibras más cortas responden a frecuencias más altas (frecuencia ∝ 1/longitud).</w:t>
+        <w:t xml:space="preserve">La onda sonora hace vibrar el fluido coclear (perilinfa); esa vibración es la que transmite la frecuencia a la membrana basilar. La opción de la 'longitud de las fibras pilosas' es una formulación imprecisa (la tonotopía depende de la posición en la membrana basilar, no de esa proporción).</w:t>
       </w:r>
     </w:p>
     <w:p>

</xml_diff>